<commit_message>
Homepage design references gathered and synthesized into a structure doc, then reconciled against two older mockups — stale copy fixed, four decisions resolved with Jackie (testimonial keep, photo confirmation, dual quote placement, UCLA credential correction), one new testimonial added then relocated to a better-fitting section, and both Word doc deliverables regenerated to match
</commit_message>
<xml_diff>
--- a/outputs/website-redesign/2026-07-29-about-page-copy.docx
+++ b/outputs/website-redesign/2026-07-29-about-page-copy.docx
@@ -68,6 +68,23 @@
       </w:r>
     </w:p>
     <w:p>
+      <w:pPr/>
+      <w:r>
+        <w:t>I'm also currently a cultural anthropology student — because asking clients to keep growing only works if I'm doing the same.</w:t>
+      </w:r>
+    </w:p>
+    <w:p>
+      <w:pPr/>
+      <w:r>
+        <w:rPr>
+          <w:i/>
+          <w:color w:val="666666"/>
+          <w:sz w:val="18"/>
+        </w:rPr>
+        <w:t>(Folded in 2026-08-03 from the old homepage mockup's About teaser; not previously in this draft.)</w:t>
+      </w:r>
+    </w:p>
+    <w:p>
       <w:pPr>
         <w:pStyle w:val="Heading1"/>
       </w:pPr>
@@ -110,7 +127,7 @@
           <w:i w:val="0"/>
           <w:sz w:val="22"/>
         </w:rPr>
-        <w:t>Before Synnovatia, I taught small business development and marketing at Corporate Coach University and Coach University, and I hold an Entrepreneurship certification from UCLA. The real education, though, has been running my own business for 25+ years — through the parts that worked and the parts that didn't.</w:t>
+        <w:t>Before Synnovatia, I taught small business development and marketing at Corporate Coach University and Coach University, and I hold a Management Development for Entrepreneurs certification from UCLA's Anderson School of Business. The real education, though, has been running my own business for 25+ years — through the parts that worked and the parts that didn't.</w:t>
       </w:r>
     </w:p>
     <w:p>

</xml_diff>